<commit_message>
docs: atualizar identidade do autor — Filipe Buba N'hada (CV completo)
- Cria empresa/CURRICULO.md (canônico) com info do CV oficial:
  Engenheiro Software, ex-Mercado Livre (2022-2024), ex-Vivo (2022),
  Pós em Ciência de Dados+IA XP, Especialização ML XP, Computação
  Impacta 2024, Licenciatura Ciências Sociais UNILAB 2021,
  Bacharelado Humanidades UNILAB 2017. PCD. Stack Node/React/Go/Java/
  Python/ML/Datadog/BigQuery.
- Substitui email nhadafilipe@gmail.com → flifnhada@hotmail.com em
  todos os docs (10 ficheiros).
- Substitui placeholder telefone → +55 11 98483-7997.
- Atualiza nome para "Filipe Buba N'hada" em assinaturas formais
  (alteração contratual, editais).
- Reforça PCD + Licenciatura UNILAB nos pitch deck + edital 04
  (cota afirmativa + habilitação docente para "Formação").
- Acrescenta seção Autor no README com formação e LinkedIn.
- Rebuilda Word docs afetados.

Co-Authored-By: Claude Opus 4.7 (1M context) <noreply@anthropic.com>
</commit_message>
<xml_diff>
--- a/empresa/Alteracao-Contratual-Datacenter-Vision.docx
+++ b/empresa/Alteracao-Contratual-Datacenter-Vision.docx
@@ -112,7 +112,7 @@
           <w:bCs/>
           <w:b/>
         </w:rPr>
-        <w:t xml:space="preserve">FILIPE BUBA</w:t>
+        <w:t xml:space="preserve">FILIPE BUBA N’HADA</w:t>
       </w:r>
       <w:r>
         <w:t xml:space="preserve">, [ nacionalidade — ex.: brasileiro ], [ estado civil — ex.: solteiro ], [ profissão — ex.: empresário ], portador da Cédula de Identidade RG nº [ NÚMERO RG ], inscrito no CPF/MF sob o nº [ NÚMERO CPF ], residente e domiciliado na Rua Silvio Barbini, nº 205, Apt. 32B, Conjunto Residencial José Bonifácio, CEP 08.250-650, São Paulo / SP;</w:t>
@@ -701,7 +701,7 @@
           <w:bCs/>
           <w:b/>
         </w:rPr>
-        <w:t xml:space="preserve">FILIPE BUBA</w:t>
+        <w:t xml:space="preserve">FILIPE BUBA N’HADA</w:t>
       </w:r>
       <w:r>
         <w:t xml:space="preserve"> </w:t>

</xml_diff>